<commit_message>
CS 1101: Unit 7 assignment - ground claims in Mohbey & Acharya chapters (verified)
</commit_message>
<xml_diff>
--- a/Term_02/CS 1101-01 Programming Fundamentals - AY2027-T1/Assignments/Unit 7 Assignment - Rafi.docx
+++ b/Term_02/CS 1101-01 Programming Fundamentals - AY2027-T1/Assignments/Unit 7 Assignment - Rafi.docx
@@ -173,7 +173,7 @@
           <w:i w:val="0"/>
           <w:sz w:val="24"/>
         </w:rPr>
-        <w:t xml:space="preserve">The raw comment has a space at both ends, all-capital words mixed with lowercase ones, and the word "speaker" where the office wants "presenter." Each fix is a string method. According to the Python documentation, methods such as </w:t>
+        <w:t xml:space="preserve">The raw comment has a space at both ends, all-capital words mixed with lowercase ones, and the word "speaker" where the office wants "presenter." Each fix is a string method. Mohbey and Acharya (2023) point out that built-in string functions return a new string and can't change the original, and the Python documentation describes </w:t>
       </w:r>
       <w:r>
         <w:rPr>
@@ -209,7 +209,7 @@
           <w:i w:val="0"/>
           <w:sz w:val="24"/>
         </w:rPr>
-        <w:t xml:space="preserve"> return a copy of the string instead of changing the original (Python Software Foundation, n.d.-b), which is why every step in the code assigns its result back to </w:t>
+        <w:t xml:space="preserve"> the same way (Python Software Foundation, n.d.-b). That's why every step in the code assigns its result back to </w:t>
       </w:r>
       <w:r>
         <w:rPr>
@@ -794,7 +794,7 @@
           <w:i w:val="0"/>
           <w:sz w:val="24"/>
         </w:rPr>
-        <w:t xml:space="preserve"> changed nothing there. That's the reason for the extra check at the bottom of the code. With no argument, </w:t>
+        <w:t xml:space="preserve"> changed nothing there. That's the reason for the extra check at the bottom of the code. The </w:t>
       </w:r>
       <w:r>
         <w:rPr>
@@ -812,7 +812,7 @@
           <w:i w:val="0"/>
           <w:sz w:val="24"/>
         </w:rPr>
-        <w:t xml:space="preserve"> treats a run of whitespace as one separator (Python Software Foundation, n.d.-b), and </w:t>
+        <w:t xml:space="preserve"> function returns a list (Mohbey &amp; Acharya, 2023), and with no argument it treats a run of whitespace as one separator (Python Software Foundation, n.d.-b). The call </w:t>
       </w:r>
       <w:r>
         <w:rPr>
@@ -844,7 +844,7 @@
           <w:i w:val="0"/>
           <w:sz w:val="24"/>
         </w:rPr>
-        <w:t xml:space="preserve">Title case was the last step. The </w:t>
+        <w:t xml:space="preserve">Title case was the last step. The String chapter lists </w:t>
       </w:r>
       <w:r>
         <w:rPr>
@@ -862,7 +862,7 @@
           <w:i w:val="0"/>
           <w:sz w:val="24"/>
         </w:rPr>
-        <w:t xml:space="preserve"> method starts every word with an uppercase letter and lowercases the rest (Python Software Foundation, n.d.-b). The output line is an f-string, which lets variables and expressions sit directly inside the quotation marks (Visually Explained, 2025), so the final line prints "The Presenter Was Great But The Room Was Cold." One quirk is worth knowing. The documentation points out that </w:t>
+        <w:t xml:space="preserve"> as the function that converts the first character of each word to upper case (Mohbey &amp; Acharya, 2023), and the Python documentation adds that the remaining letters are lowercased (Python Software Foundation, n.d.-b). The output line is an f-string, which lets variables and expressions sit directly inside the quotation marks (Visually Explained, 2025), so the final line prints "The Presenter Was Great But The Room Was Cold." One quirk is worth knowing. The documentation points out that </w:t>
       </w:r>
       <w:r>
         <w:rPr>
@@ -927,7 +927,7 @@
           <w:i w:val="0"/>
           <w:sz w:val="24"/>
         </w:rPr>
-        <w:t xml:space="preserve"> holds three cleaned messages, and the first is the result from Q1. Opening </w:t>
+        <w:t xml:space="preserve"> holds three cleaned messages, and the first is the result from Q1. According to Mohbey and Acharya (2023), </w:t>
       </w:r>
       <w:r>
         <w:rPr>
@@ -936,7 +936,7 @@
           <w:i w:val="0"/>
           <w:sz w:val="22"/>
         </w:rPr>
-        <w:t>feedback.txt</w:t>
+        <w:t>"w"</w:t>
       </w:r>
       <w:r>
         <w:rPr>
@@ -945,7 +945,7 @@
           <w:i w:val="0"/>
           <w:sz w:val="24"/>
         </w:rPr>
-        <w:t xml:space="preserve"> in </w:t>
+        <w:t xml:space="preserve"> mode overwrites a file that already exists, so opening </w:t>
       </w:r>
       <w:r>
         <w:rPr>
@@ -954,7 +954,7 @@
           <w:i w:val="0"/>
           <w:sz w:val="22"/>
         </w:rPr>
-        <w:t>"w"</w:t>
+        <w:t>feedback.txt</w:t>
       </w:r>
       <w:r>
         <w:rPr>
@@ -963,7 +963,7 @@
           <w:i w:val="0"/>
           <w:sz w:val="24"/>
         </w:rPr>
-        <w:t xml:space="preserve"> mode creates it, though the Python tutorial warns that an existing file with the same name gets erased in this mode (Python Software Foundation, n.d.-d). Since no </w:t>
+        <w:t xml:space="preserve"> this way would replace it on any later run. Since no </w:t>
       </w:r>
       <w:r>
         <w:rPr>
@@ -1017,7 +1017,7 @@
           <w:i w:val="0"/>
           <w:sz w:val="24"/>
         </w:rPr>
-        <w:t xml:space="preserve"> block for each file operation because the tutorial says it closes the file properly even if an exception is raised partway through (Python Software Foundation, n.d.-d). The </w:t>
+        <w:t xml:space="preserve"> block for each file operation because the Python tutorial says it closes the file properly even if an exception is raised partway through (Python Software Foundation, n.d.-d). The </w:t>
       </w:r>
       <w:r>
         <w:rPr>
@@ -1035,7 +1035,7 @@
           <w:i w:val="0"/>
           <w:sz w:val="24"/>
         </w:rPr>
-        <w:t xml:space="preserve"> method, which Mohbey and Acharya (2023) cover in their File Handling chapter, writes only what it is given, so I added </w:t>
+        <w:t xml:space="preserve"> method expects strings (Mohbey &amp; Acharya, 2023) and doesn't add a line break by itself, so I added </w:t>
       </w:r>
       <w:r>
         <w:rPr>
@@ -1765,7 +1765,7 @@
           <w:i w:val="0"/>
           <w:sz w:val="24"/>
         </w:rPr>
-        <w:t xml:space="preserve"> mode, which adds new data to the end of the file (Python Software Foundation, n.d.-d) instead of replacing it. The second read in the output shows the original three lines followed by "Please Add More Hands-On Activities" at the bottom, so nothing was lost.</w:t>
+        <w:t xml:space="preserve"> mode, which adds to the end of an existing file and creates one if it doesn't exist (Mohbey &amp; Acharya, 2023). The second read in the output shows the original three lines followed by "Please Add More Hands-On Activities" at the bottom, so nothing was lost.</w:t>
       </w:r>
     </w:p>
     <w:p>
@@ -1794,7 +1794,7 @@
           <w:i w:val="0"/>
           <w:sz w:val="24"/>
         </w:rPr>
-        <w:t xml:space="preserve">Opening a file that doesn't exist would normally stop the program with a traceback. Putting the read inside </w:t>
+        <w:t xml:space="preserve">Opening a file that doesn't exist would normally stop the program with a traceback. Mohbey and Acharya (2023) explain that a program ends unexpectedly and without warning when it doesn't handle an exception, and that wrapping risky code in a </w:t>
       </w:r>
       <w:r>
         <w:rPr>
@@ -1812,7 +1812,7 @@
           <w:i w:val="0"/>
           <w:sz w:val="24"/>
         </w:rPr>
-        <w:t xml:space="preserve"> and </w:t>
+        <w:t xml:space="preserve"> block with an </w:t>
       </w:r>
       <w:r>
         <w:rPr>
@@ -1830,7 +1830,7 @@
           <w:i w:val="0"/>
           <w:sz w:val="24"/>
         </w:rPr>
-        <w:t xml:space="preserve"> keeps the program in control, and Mohbey and Acharya (2023) describe </w:t>
+        <w:t xml:space="preserve"> block after it guards against that. In the code below I named the exceptions instead of using a bare </w:t>
       </w:r>
       <w:r>
         <w:rPr>
@@ -1839,7 +1839,7 @@
           <w:i w:val="0"/>
           <w:sz w:val="22"/>
         </w:rPr>
-        <w:t>try</w:t>
+        <w:t>except</w:t>
       </w:r>
       <w:r>
         <w:rPr>
@@ -1848,7 +1848,7 @@
           <w:i w:val="0"/>
           <w:sz w:val="24"/>
         </w:rPr>
-        <w:t xml:space="preserve"> and </w:t>
+        <w:t xml:space="preserve">. The Python documentation describes </w:t>
       </w:r>
       <w:r>
         <w:rPr>
@@ -1857,7 +1857,7 @@
           <w:i w:val="0"/>
           <w:sz w:val="22"/>
         </w:rPr>
-        <w:t>except</w:t>
+        <w:t>FileNotFoundError</w:t>
       </w:r>
       <w:r>
         <w:rPr>
@@ -1866,7 +1866,7 @@
           <w:i w:val="0"/>
           <w:sz w:val="24"/>
         </w:rPr>
-        <w:t xml:space="preserve"> blocks as a way to handle runtime errors without interrupting the program's flow. In the code below I named the exceptions instead of using a bare </w:t>
+        <w:t xml:space="preserve"> as the error raised when a file or directory is requested but doesn't exist, and </w:t>
       </w:r>
       <w:r>
         <w:rPr>
@@ -1875,7 +1875,7 @@
           <w:i w:val="0"/>
           <w:sz w:val="22"/>
         </w:rPr>
-        <w:t>except</w:t>
+        <w:t>PermissionError</w:t>
       </w:r>
       <w:r>
         <w:rPr>
@@ -1884,7 +1884,21 @@
           <w:i w:val="0"/>
           <w:sz w:val="24"/>
         </w:rPr>
-        <w:t xml:space="preserve">. The Python documentation describes </w:t>
+        <w:t xml:space="preserve"> as the one raised when an operation is attempted without adequate access rights (Python Software Foundation, n.d.-a). Each gets the exact message the assignment asks for.</w:t>
+      </w:r>
+    </w:p>
+    <w:p>
+      <w:pPr>
+        <w:spacing w:before="0" w:after="0" w:line="480" w:lineRule="auto"/>
+      </w:pPr>
+      <w:r>
+        <w:rPr>
+          <w:rFonts w:ascii="Times New Roman" w:hAnsi="Times New Roman" w:cs="Times New Roman" w:eastAsia="Times New Roman"/>
+          <w:b w:val="0"/>
+          <w:i w:val="0"/>
+          <w:sz w:val="24"/>
+        </w:rPr>
+        <w:t xml:space="preserve">The </w:t>
       </w:r>
       <w:r>
         <w:rPr>
@@ -1893,7 +1907,7 @@
           <w:i w:val="0"/>
           <w:sz w:val="22"/>
         </w:rPr>
-        <w:t>FileNotFoundError</w:t>
+        <w:t>finally</w:t>
       </w:r>
       <w:r>
         <w:rPr>
@@ -1902,7 +1916,7 @@
           <w:i w:val="0"/>
           <w:sz w:val="24"/>
         </w:rPr>
-        <w:t xml:space="preserve"> as the error raised when a file or directory is requested but doesn't exist, and </w:t>
+        <w:t xml:space="preserve"> block is what prints "Operation completed." Its code always runs, whether or not an exception occurs (Mohbey &amp; Acharya, 2023), and the Python documentation says the same about a </w:t>
       </w:r>
       <w:r>
         <w:rPr>
@@ -1911,7 +1925,7 @@
           <w:i w:val="0"/>
           <w:sz w:val="22"/>
         </w:rPr>
-        <w:t>PermissionError</w:t>
+        <w:t>finally</w:t>
       </w:r>
       <w:r>
         <w:rPr>
@@ -1920,13 +1934,17 @@
           <w:i w:val="0"/>
           <w:sz w:val="24"/>
         </w:rPr>
-        <w:t xml:space="preserve"> as the one raised when an operation is attempted without adequate access rights (Python Software Foundation, n.d.-a). Each gets the exact message the assignment asks for.</w:t>
-      </w:r>
-    </w:p>
-    <w:p>
-      <w:pPr>
-        <w:spacing w:before="0" w:after="0" w:line="480" w:lineRule="auto"/>
-      </w:pPr>
+        <w:t xml:space="preserve"> clause (Python Software Foundation, n.d.-c). That's why the message appears on every path through the program. Dave Gray (2023) pairs </w:t>
+      </w:r>
+      <w:r>
+        <w:rPr>
+          <w:rFonts w:ascii="Courier New" w:hAnsi="Courier New" w:cs="Courier New" w:eastAsia="Courier New"/>
+          <w:b w:val="0"/>
+          <w:i w:val="0"/>
+          <w:sz w:val="22"/>
+        </w:rPr>
+        <w:t>try</w:t>
+      </w:r>
       <w:r>
         <w:rPr>
           <w:rFonts w:ascii="Times New Roman" w:hAnsi="Times New Roman" w:cs="Times New Roman" w:eastAsia="Times New Roman"/>
@@ -1934,7 +1952,7 @@
           <w:i w:val="0"/>
           <w:sz w:val="24"/>
         </w:rPr>
-        <w:t xml:space="preserve">The </w:t>
+        <w:t xml:space="preserve">, </w:t>
       </w:r>
       <w:r>
         <w:rPr>
@@ -1943,7 +1961,7 @@
           <w:i w:val="0"/>
           <w:sz w:val="22"/>
         </w:rPr>
-        <w:t>finally</w:t>
+        <w:t>except</w:t>
       </w:r>
       <w:r>
         <w:rPr>
@@ -1952,7 +1970,7 @@
           <w:i w:val="0"/>
           <w:sz w:val="24"/>
         </w:rPr>
-        <w:t xml:space="preserve"> block is what prints "Operation completed." The documentation says a </w:t>
+        <w:t xml:space="preserve">, and </w:t>
       </w:r>
       <w:r>
         <w:rPr>
@@ -1970,7 +1988,211 @@
           <w:i w:val="0"/>
           <w:sz w:val="24"/>
         </w:rPr>
-        <w:t xml:space="preserve"> clause runs whether or not the </w:t>
+        <w:t xml:space="preserve"> with file handling in the same way.</w:t>
+      </w:r>
+    </w:p>
+    <w:p>
+      <w:pPr>
+        <w:keepNext/>
+        <w:spacing w:before="0" w:after="0" w:line="240" w:lineRule="auto"/>
+      </w:pPr>
+      <w:r>
+        <w:rPr>
+          <w:rFonts w:ascii="Courier New" w:hAnsi="Courier New" w:cs="Courier New" w:eastAsia="Courier New"/>
+          <w:b w:val="0"/>
+          <w:i w:val="0"/>
+          <w:sz w:val="20"/>
+        </w:rPr>
+        <w:t>Code:</w:t>
+      </w:r>
+    </w:p>
+    <w:p>
+      <w:pPr>
+        <w:keepNext/>
+        <w:spacing w:before="0" w:after="0" w:line="240" w:lineRule="auto"/>
+      </w:pPr>
+      <w:r>
+        <w:rPr>
+          <w:rFonts w:ascii="Courier New" w:hAnsi="Courier New" w:cs="Courier New" w:eastAsia="Courier New"/>
+          <w:b w:val="0"/>
+          <w:i w:val="0"/>
+          <w:sz w:val="20"/>
+        </w:rPr>
+        <w:t># Question 3: Reading feedback.txt safely with exception handling</w:t>
+      </w:r>
+    </w:p>
+    <w:p>
+      <w:pPr>
+        <w:keepNext/>
+        <w:spacing w:before="0" w:after="0" w:line="240" w:lineRule="auto"/>
+      </w:pPr>
+      <w:r>
+        <w:rPr>
+          <w:rFonts w:ascii="Courier New" w:hAnsi="Courier New" w:cs="Courier New" w:eastAsia="Courier New"/>
+          <w:b w:val="0"/>
+          <w:i w:val="0"/>
+          <w:sz w:val="20"/>
+        </w:rPr>
+        <w:t>try:</w:t>
+      </w:r>
+    </w:p>
+    <w:p>
+      <w:pPr>
+        <w:keepNext/>
+        <w:spacing w:before="0" w:after="0" w:line="240" w:lineRule="auto"/>
+      </w:pPr>
+      <w:r>
+        <w:rPr>
+          <w:rFonts w:ascii="Courier New" w:hAnsi="Courier New" w:cs="Courier New" w:eastAsia="Courier New"/>
+          <w:b w:val="0"/>
+          <w:i w:val="0"/>
+          <w:sz w:val="20"/>
+        </w:rPr>
+        <w:t xml:space="preserve">    with open("feedback.txt", "r") as file:</w:t>
+      </w:r>
+    </w:p>
+    <w:p>
+      <w:pPr>
+        <w:keepNext/>
+        <w:spacing w:before="0" w:after="0" w:line="240" w:lineRule="auto"/>
+      </w:pPr>
+      <w:r>
+        <w:rPr>
+          <w:rFonts w:ascii="Courier New" w:hAnsi="Courier New" w:cs="Courier New" w:eastAsia="Courier New"/>
+          <w:b w:val="0"/>
+          <w:i w:val="0"/>
+          <w:sz w:val="20"/>
+        </w:rPr>
+        <w:t xml:space="preserve">        for line in file:</w:t>
+      </w:r>
+    </w:p>
+    <w:p>
+      <w:pPr>
+        <w:keepNext/>
+        <w:spacing w:before="0" w:after="0" w:line="240" w:lineRule="auto"/>
+      </w:pPr>
+      <w:r>
+        <w:rPr>
+          <w:rFonts w:ascii="Courier New" w:hAnsi="Courier New" w:cs="Courier New" w:eastAsia="Courier New"/>
+          <w:b w:val="0"/>
+          <w:i w:val="0"/>
+          <w:sz w:val="20"/>
+        </w:rPr>
+        <w:t xml:space="preserve">            print(line.strip())</w:t>
+      </w:r>
+    </w:p>
+    <w:p>
+      <w:pPr>
+        <w:keepNext/>
+        <w:spacing w:before="0" w:after="0" w:line="240" w:lineRule="auto"/>
+      </w:pPr>
+      <w:r>
+        <w:rPr>
+          <w:rFonts w:ascii="Courier New" w:hAnsi="Courier New" w:cs="Courier New" w:eastAsia="Courier New"/>
+          <w:b w:val="0"/>
+          <w:i w:val="0"/>
+          <w:sz w:val="20"/>
+        </w:rPr>
+        <w:t>except FileNotFoundError:</w:t>
+      </w:r>
+    </w:p>
+    <w:p>
+      <w:pPr>
+        <w:keepNext/>
+        <w:spacing w:before="0" w:after="0" w:line="240" w:lineRule="auto"/>
+      </w:pPr>
+      <w:r>
+        <w:rPr>
+          <w:rFonts w:ascii="Courier New" w:hAnsi="Courier New" w:cs="Courier New" w:eastAsia="Courier New"/>
+          <w:b w:val="0"/>
+          <w:i w:val="0"/>
+          <w:sz w:val="20"/>
+        </w:rPr>
+        <w:t xml:space="preserve">    print("File not found. Please create feedback.txt first.")</w:t>
+      </w:r>
+    </w:p>
+    <w:p>
+      <w:pPr>
+        <w:keepNext/>
+        <w:spacing w:before="0" w:after="0" w:line="240" w:lineRule="auto"/>
+      </w:pPr>
+      <w:r>
+        <w:rPr>
+          <w:rFonts w:ascii="Courier New" w:hAnsi="Courier New" w:cs="Courier New" w:eastAsia="Courier New"/>
+          <w:b w:val="0"/>
+          <w:i w:val="0"/>
+          <w:sz w:val="20"/>
+        </w:rPr>
+        <w:t>except PermissionError:</w:t>
+      </w:r>
+    </w:p>
+    <w:p>
+      <w:pPr>
+        <w:keepNext/>
+        <w:spacing w:before="0" w:after="0" w:line="240" w:lineRule="auto"/>
+      </w:pPr>
+      <w:r>
+        <w:rPr>
+          <w:rFonts w:ascii="Courier New" w:hAnsi="Courier New" w:cs="Courier New" w:eastAsia="Courier New"/>
+          <w:b w:val="0"/>
+          <w:i w:val="0"/>
+          <w:sz w:val="20"/>
+        </w:rPr>
+        <w:t xml:space="preserve">    print("Permission denied. Close the file and try again.")</w:t>
+      </w:r>
+    </w:p>
+    <w:p>
+      <w:pPr>
+        <w:keepNext/>
+        <w:spacing w:before="0" w:after="0" w:line="240" w:lineRule="auto"/>
+      </w:pPr>
+      <w:r>
+        <w:rPr>
+          <w:rFonts w:ascii="Courier New" w:hAnsi="Courier New" w:cs="Courier New" w:eastAsia="Courier New"/>
+          <w:b w:val="0"/>
+          <w:i w:val="0"/>
+          <w:sz w:val="20"/>
+        </w:rPr>
+        <w:t>finally:</w:t>
+      </w:r>
+    </w:p>
+    <w:p>
+      <w:pPr>
+        <w:keepNext/>
+        <w:spacing w:before="0" w:after="0" w:line="240" w:lineRule="auto"/>
+      </w:pPr>
+      <w:r>
+        <w:rPr>
+          <w:rFonts w:ascii="Courier New" w:hAnsi="Courier New" w:cs="Courier New" w:eastAsia="Courier New"/>
+          <w:b w:val="0"/>
+          <w:i w:val="0"/>
+          <w:sz w:val="20"/>
+        </w:rPr>
+        <w:t xml:space="preserve">    print("Operation completed.")</w:t>
+      </w:r>
+    </w:p>
+    <w:p>
+      <w:pPr>
+        <w:spacing w:before="0" w:after="0" w:line="240" w:lineRule="auto"/>
+      </w:pPr>
+    </w:p>
+    <w:p>
+      <w:pPr>
+        <w:spacing w:before="0" w:after="0" w:line="240" w:lineRule="auto"/>
+      </w:pPr>
+    </w:p>
+    <w:p>
+      <w:pPr>
+        <w:spacing w:before="0" w:after="0" w:line="480" w:lineRule="auto"/>
+      </w:pPr>
+      <w:r>
+        <w:rPr>
+          <w:rFonts w:ascii="Times New Roman" w:hAnsi="Times New Roman" w:cs="Times New Roman" w:eastAsia="Times New Roman"/>
+          <w:b w:val="0"/>
+          <w:i w:val="0"/>
+          <w:sz w:val="24"/>
+        </w:rPr>
+        <w:t xml:space="preserve">I ran the program three times. In the first run </w:t>
       </w:r>
       <w:r>
         <w:rPr>
@@ -1979,7 +2201,7 @@
           <w:i w:val="0"/>
           <w:sz w:val="22"/>
         </w:rPr>
-        <w:t>try</w:t>
+        <w:t>feedback.txt</w:t>
       </w:r>
       <w:r>
         <w:rPr>
@@ -1988,7 +2210,7 @@
           <w:i w:val="0"/>
           <w:sz w:val="24"/>
         </w:rPr>
-        <w:t xml:space="preserve"> statement produces an exception (Python Software Foundation, n.d.-c), so the message appears on every path through the program. Dave Gray (2023) pairs </w:t>
+        <w:t xml:space="preserve"> existed, and the second run happened after I renamed the file so it was missing. The third run needed a different approach, because I wanted to test the </w:t>
       </w:r>
       <w:r>
         <w:rPr>
@@ -1997,7 +2219,7 @@
           <w:i w:val="0"/>
           <w:sz w:val="22"/>
         </w:rPr>
-        <w:t>try</w:t>
+        <w:t>PermissionError</w:t>
       </w:r>
       <w:r>
         <w:rPr>
@@ -2006,7 +2228,7 @@
           <w:i w:val="0"/>
           <w:sz w:val="24"/>
         </w:rPr>
-        <w:t xml:space="preserve">, </w:t>
+        <w:t xml:space="preserve"> branch without locking a real file. I temporarily added a </w:t>
       </w:r>
       <w:r>
         <w:rPr>
@@ -2015,7 +2237,7 @@
           <w:i w:val="0"/>
           <w:sz w:val="22"/>
         </w:rPr>
-        <w:t>except</w:t>
+        <w:t>raise PermissionError</w:t>
       </w:r>
       <w:r>
         <w:rPr>
@@ -2024,7 +2246,7 @@
           <w:i w:val="0"/>
           <w:sz w:val="24"/>
         </w:rPr>
-        <w:t xml:space="preserve">, and </w:t>
+        <w:t xml:space="preserve"> line at the top of the </w:t>
       </w:r>
       <w:r>
         <w:rPr>
@@ -2033,7 +2255,7 @@
           <w:i w:val="0"/>
           <w:sz w:val="22"/>
         </w:rPr>
-        <w:t>finally</w:t>
+        <w:t>try</w:t>
       </w:r>
       <w:r>
         <w:rPr>
@@ -2042,7 +2264,7 @@
           <w:i w:val="0"/>
           <w:sz w:val="24"/>
         </w:rPr>
-        <w:t xml:space="preserve"> with file handling in the same way.</w:t>
+        <w:t xml:space="preserve"> block. That line is only a test aid and isn't part of the program above.</w:t>
       </w:r>
     </w:p>
     <w:p>
@@ -2057,7 +2279,7 @@
           <w:i w:val="0"/>
           <w:sz w:val="20"/>
         </w:rPr>
-        <w:t>Code:</w:t>
+        <w:t>Output (run 1, file exists):</w:t>
       </w:r>
     </w:p>
     <w:p>
@@ -2072,7 +2294,7 @@
           <w:i w:val="0"/>
           <w:sz w:val="20"/>
         </w:rPr>
-        <w:t># Question 3: Reading feedback.txt safely with exception handling</w:t>
+        <w:t>The Presenter Was Great But The Room Was Cold</w:t>
       </w:r>
     </w:p>
     <w:p>
@@ -2087,7 +2309,7 @@
           <w:i w:val="0"/>
           <w:sz w:val="20"/>
         </w:rPr>
-        <w:t>try:</w:t>
+        <w:t>Great Examples And Clear Slides</w:t>
       </w:r>
     </w:p>
     <w:p>
@@ -2102,7 +2324,7 @@
           <w:i w:val="0"/>
           <w:sz w:val="20"/>
         </w:rPr>
-        <w:t xml:space="preserve">    with open("feedback.txt", "r") as file:</w:t>
+        <w:t>The Workshop Started Late</w:t>
       </w:r>
     </w:p>
     <w:p>
@@ -2117,12 +2339,11 @@
           <w:i w:val="0"/>
           <w:sz w:val="20"/>
         </w:rPr>
-        <w:t xml:space="preserve">        for line in file:</w:t>
+        <w:t>Please Add More Hands-On Activities</w:t>
       </w:r>
     </w:p>
     <w:p>
       <w:pPr>
-        <w:keepNext/>
         <w:spacing w:before="0" w:after="0" w:line="240" w:lineRule="auto"/>
       </w:pPr>
       <w:r>
@@ -2132,8 +2353,13 @@
           <w:i w:val="0"/>
           <w:sz w:val="20"/>
         </w:rPr>
-        <w:t xml:space="preserve">            print(line.strip())</w:t>
-      </w:r>
+        <w:t>Operation completed.</w:t>
+      </w:r>
+    </w:p>
+    <w:p>
+      <w:pPr>
+        <w:spacing w:before="0" w:after="0" w:line="240" w:lineRule="auto"/>
+      </w:pPr>
     </w:p>
     <w:p>
       <w:pPr>
@@ -2147,7 +2373,7 @@
           <w:i w:val="0"/>
           <w:sz w:val="20"/>
         </w:rPr>
-        <w:t>except FileNotFoundError:</w:t>
+        <w:t>Output (run 2, file missing):</w:t>
       </w:r>
     </w:p>
     <w:p>
@@ -2162,12 +2388,11 @@
           <w:i w:val="0"/>
           <w:sz w:val="20"/>
         </w:rPr>
-        <w:t xml:space="preserve">    print("File not found. Please create feedback.txt first.")</w:t>
+        <w:t>File not found. Please create feedback.txt first.</w:t>
       </w:r>
     </w:p>
     <w:p>
       <w:pPr>
-        <w:keepNext/>
         <w:spacing w:before="0" w:after="0" w:line="240" w:lineRule="auto"/>
       </w:pPr>
       <w:r>
@@ -2177,8 +2402,13 @@
           <w:i w:val="0"/>
           <w:sz w:val="20"/>
         </w:rPr>
-        <w:t>except PermissionError:</w:t>
-      </w:r>
+        <w:t>Operation completed.</w:t>
+      </w:r>
+    </w:p>
+    <w:p>
+      <w:pPr>
+        <w:spacing w:before="0" w:after="0" w:line="240" w:lineRule="auto"/>
+      </w:pPr>
     </w:p>
     <w:p>
       <w:pPr>
@@ -2192,7 +2422,7 @@
           <w:i w:val="0"/>
           <w:sz w:val="20"/>
         </w:rPr>
-        <w:t xml:space="preserve">    print("Permission denied. Close the file and try again.")</w:t>
+        <w:t>Output (run 3, simulated PermissionError):</w:t>
       </w:r>
     </w:p>
     <w:p>
@@ -2207,12 +2437,11 @@
           <w:i w:val="0"/>
           <w:sz w:val="20"/>
         </w:rPr>
-        <w:t>finally:</w:t>
+        <w:t>Permission denied. Close the file and try again.</w:t>
       </w:r>
     </w:p>
     <w:p>
       <w:pPr>
-        <w:keepNext/>
         <w:spacing w:before="0" w:after="0" w:line="240" w:lineRule="auto"/>
       </w:pPr>
       <w:r>
@@ -2222,13 +2451,8 @@
           <w:i w:val="0"/>
           <w:sz w:val="20"/>
         </w:rPr>
-        <w:t xml:space="preserve">    print("Operation completed.")</w:t>
-      </w:r>
-    </w:p>
-    <w:p>
-      <w:pPr>
-        <w:spacing w:before="0" w:after="0" w:line="240" w:lineRule="auto"/>
-      </w:pPr>
+        <w:t>Operation completed.</w:t>
+      </w:r>
     </w:p>
     <w:p>
       <w:pPr>
@@ -2246,7 +2470,36 @@
           <w:i w:val="0"/>
           <w:sz w:val="24"/>
         </w:rPr>
-        <w:t xml:space="preserve">I ran the program three times. In the first run </w:t>
+        <w:t>All three runs end with "Operation completed." The first prints the saved feedback, and the second and third each print only their own error message. Neither error crashed the program.</w:t>
+      </w:r>
+    </w:p>
+    <w:p>
+      <w:pPr>
+        <w:keepNext/>
+        <w:spacing w:before="0" w:after="0" w:line="480" w:lineRule="auto"/>
+      </w:pPr>
+      <w:r>
+        <w:rPr>
+          <w:rFonts w:ascii="Times New Roman" w:hAnsi="Times New Roman" w:cs="Times New Roman" w:eastAsia="Times New Roman"/>
+          <w:b/>
+          <w:i w:val="0"/>
+          <w:sz w:val="24"/>
+        </w:rPr>
+        <w:t>Q4: Counting Mentions of "Great" and Writing a Summary</w:t>
+      </w:r>
+    </w:p>
+    <w:p>
+      <w:pPr>
+        <w:spacing w:before="0" w:after="0" w:line="480" w:lineRule="auto"/>
+      </w:pPr>
+      <w:r>
+        <w:rPr>
+          <w:rFonts w:ascii="Times New Roman" w:hAnsi="Times New Roman" w:cs="Times New Roman" w:eastAsia="Times New Roman"/>
+          <w:b w:val="0"/>
+          <w:i w:val="0"/>
+          <w:sz w:val="24"/>
+        </w:rPr>
+        <w:t xml:space="preserve">The last program reads </w:t>
       </w:r>
       <w:r>
         <w:rPr>
@@ -2264,7 +2517,7 @@
           <w:i w:val="0"/>
           <w:sz w:val="24"/>
         </w:rPr>
-        <w:t xml:space="preserve"> existed, and the second run happened after I renamed the file so it was missing. The third run needed a different approach, because I wanted to test the </w:t>
+        <w:t xml:space="preserve"> with </w:t>
       </w:r>
       <w:r>
         <w:rPr>
@@ -2273,7 +2526,7 @@
           <w:i w:val="0"/>
           <w:sz w:val="22"/>
         </w:rPr>
-        <w:t>PermissionError</w:t>
+        <w:t>readlines()</w:t>
       </w:r>
       <w:r>
         <w:rPr>
@@ -2282,314 +2535,7 @@
           <w:i w:val="0"/>
           <w:sz w:val="24"/>
         </w:rPr>
-        <w:t xml:space="preserve"> branch without locking a real file. I temporarily added a </w:t>
-      </w:r>
-      <w:r>
-        <w:rPr>
-          <w:rFonts w:ascii="Courier New" w:hAnsi="Courier New" w:cs="Courier New" w:eastAsia="Courier New"/>
-          <w:b w:val="0"/>
-          <w:i w:val="0"/>
-          <w:sz w:val="22"/>
-        </w:rPr>
-        <w:t>raise PermissionError</w:t>
-      </w:r>
-      <w:r>
-        <w:rPr>
-          <w:rFonts w:ascii="Times New Roman" w:hAnsi="Times New Roman" w:cs="Times New Roman" w:eastAsia="Times New Roman"/>
-          <w:b w:val="0"/>
-          <w:i w:val="0"/>
-          <w:sz w:val="24"/>
-        </w:rPr>
-        <w:t xml:space="preserve"> line at the top of the </w:t>
-      </w:r>
-      <w:r>
-        <w:rPr>
-          <w:rFonts w:ascii="Courier New" w:hAnsi="Courier New" w:cs="Courier New" w:eastAsia="Courier New"/>
-          <w:b w:val="0"/>
-          <w:i w:val="0"/>
-          <w:sz w:val="22"/>
-        </w:rPr>
-        <w:t>try</w:t>
-      </w:r>
-      <w:r>
-        <w:rPr>
-          <w:rFonts w:ascii="Times New Roman" w:hAnsi="Times New Roman" w:cs="Times New Roman" w:eastAsia="Times New Roman"/>
-          <w:b w:val="0"/>
-          <w:i w:val="0"/>
-          <w:sz w:val="24"/>
-        </w:rPr>
-        <w:t xml:space="preserve"> block. That line is only a test aid and isn't part of the program above.</w:t>
-      </w:r>
-    </w:p>
-    <w:p>
-      <w:pPr>
-        <w:keepNext/>
-        <w:spacing w:before="0" w:after="0" w:line="240" w:lineRule="auto"/>
-      </w:pPr>
-      <w:r>
-        <w:rPr>
-          <w:rFonts w:ascii="Courier New" w:hAnsi="Courier New" w:cs="Courier New" w:eastAsia="Courier New"/>
-          <w:b w:val="0"/>
-          <w:i w:val="0"/>
-          <w:sz w:val="20"/>
-        </w:rPr>
-        <w:t>Output (run 1, file exists):</w:t>
-      </w:r>
-    </w:p>
-    <w:p>
-      <w:pPr>
-        <w:keepNext/>
-        <w:spacing w:before="0" w:after="0" w:line="240" w:lineRule="auto"/>
-      </w:pPr>
-      <w:r>
-        <w:rPr>
-          <w:rFonts w:ascii="Courier New" w:hAnsi="Courier New" w:cs="Courier New" w:eastAsia="Courier New"/>
-          <w:b w:val="0"/>
-          <w:i w:val="0"/>
-          <w:sz w:val="20"/>
-        </w:rPr>
-        <w:t>The Presenter Was Great But The Room Was Cold</w:t>
-      </w:r>
-    </w:p>
-    <w:p>
-      <w:pPr>
-        <w:keepNext/>
-        <w:spacing w:before="0" w:after="0" w:line="240" w:lineRule="auto"/>
-      </w:pPr>
-      <w:r>
-        <w:rPr>
-          <w:rFonts w:ascii="Courier New" w:hAnsi="Courier New" w:cs="Courier New" w:eastAsia="Courier New"/>
-          <w:b w:val="0"/>
-          <w:i w:val="0"/>
-          <w:sz w:val="20"/>
-        </w:rPr>
-        <w:t>Great Examples And Clear Slides</w:t>
-      </w:r>
-    </w:p>
-    <w:p>
-      <w:pPr>
-        <w:keepNext/>
-        <w:spacing w:before="0" w:after="0" w:line="240" w:lineRule="auto"/>
-      </w:pPr>
-      <w:r>
-        <w:rPr>
-          <w:rFonts w:ascii="Courier New" w:hAnsi="Courier New" w:cs="Courier New" w:eastAsia="Courier New"/>
-          <w:b w:val="0"/>
-          <w:i w:val="0"/>
-          <w:sz w:val="20"/>
-        </w:rPr>
-        <w:t>The Workshop Started Late</w:t>
-      </w:r>
-    </w:p>
-    <w:p>
-      <w:pPr>
-        <w:keepNext/>
-        <w:spacing w:before="0" w:after="0" w:line="240" w:lineRule="auto"/>
-      </w:pPr>
-      <w:r>
-        <w:rPr>
-          <w:rFonts w:ascii="Courier New" w:hAnsi="Courier New" w:cs="Courier New" w:eastAsia="Courier New"/>
-          <w:b w:val="0"/>
-          <w:i w:val="0"/>
-          <w:sz w:val="20"/>
-        </w:rPr>
-        <w:t>Please Add More Hands-On Activities</w:t>
-      </w:r>
-    </w:p>
-    <w:p>
-      <w:pPr>
-        <w:spacing w:before="0" w:after="0" w:line="240" w:lineRule="auto"/>
-      </w:pPr>
-      <w:r>
-        <w:rPr>
-          <w:rFonts w:ascii="Courier New" w:hAnsi="Courier New" w:cs="Courier New" w:eastAsia="Courier New"/>
-          <w:b w:val="0"/>
-          <w:i w:val="0"/>
-          <w:sz w:val="20"/>
-        </w:rPr>
-        <w:t>Operation completed.</w:t>
-      </w:r>
-    </w:p>
-    <w:p>
-      <w:pPr>
-        <w:spacing w:before="0" w:after="0" w:line="240" w:lineRule="auto"/>
-      </w:pPr>
-    </w:p>
-    <w:p>
-      <w:pPr>
-        <w:keepNext/>
-        <w:spacing w:before="0" w:after="0" w:line="240" w:lineRule="auto"/>
-      </w:pPr>
-      <w:r>
-        <w:rPr>
-          <w:rFonts w:ascii="Courier New" w:hAnsi="Courier New" w:cs="Courier New" w:eastAsia="Courier New"/>
-          <w:b w:val="0"/>
-          <w:i w:val="0"/>
-          <w:sz w:val="20"/>
-        </w:rPr>
-        <w:t>Output (run 2, file missing):</w:t>
-      </w:r>
-    </w:p>
-    <w:p>
-      <w:pPr>
-        <w:keepNext/>
-        <w:spacing w:before="0" w:after="0" w:line="240" w:lineRule="auto"/>
-      </w:pPr>
-      <w:r>
-        <w:rPr>
-          <w:rFonts w:ascii="Courier New" w:hAnsi="Courier New" w:cs="Courier New" w:eastAsia="Courier New"/>
-          <w:b w:val="0"/>
-          <w:i w:val="0"/>
-          <w:sz w:val="20"/>
-        </w:rPr>
-        <w:t>File not found. Please create feedback.txt first.</w:t>
-      </w:r>
-    </w:p>
-    <w:p>
-      <w:pPr>
-        <w:spacing w:before="0" w:after="0" w:line="240" w:lineRule="auto"/>
-      </w:pPr>
-      <w:r>
-        <w:rPr>
-          <w:rFonts w:ascii="Courier New" w:hAnsi="Courier New" w:cs="Courier New" w:eastAsia="Courier New"/>
-          <w:b w:val="0"/>
-          <w:i w:val="0"/>
-          <w:sz w:val="20"/>
-        </w:rPr>
-        <w:t>Operation completed.</w:t>
-      </w:r>
-    </w:p>
-    <w:p>
-      <w:pPr>
-        <w:spacing w:before="0" w:after="0" w:line="240" w:lineRule="auto"/>
-      </w:pPr>
-    </w:p>
-    <w:p>
-      <w:pPr>
-        <w:keepNext/>
-        <w:spacing w:before="0" w:after="0" w:line="240" w:lineRule="auto"/>
-      </w:pPr>
-      <w:r>
-        <w:rPr>
-          <w:rFonts w:ascii="Courier New" w:hAnsi="Courier New" w:cs="Courier New" w:eastAsia="Courier New"/>
-          <w:b w:val="0"/>
-          <w:i w:val="0"/>
-          <w:sz w:val="20"/>
-        </w:rPr>
-        <w:t>Output (run 3, simulated PermissionError):</w:t>
-      </w:r>
-    </w:p>
-    <w:p>
-      <w:pPr>
-        <w:keepNext/>
-        <w:spacing w:before="0" w:after="0" w:line="240" w:lineRule="auto"/>
-      </w:pPr>
-      <w:r>
-        <w:rPr>
-          <w:rFonts w:ascii="Courier New" w:hAnsi="Courier New" w:cs="Courier New" w:eastAsia="Courier New"/>
-          <w:b w:val="0"/>
-          <w:i w:val="0"/>
-          <w:sz w:val="20"/>
-        </w:rPr>
-        <w:t>Permission denied. Close the file and try again.</w:t>
-      </w:r>
-    </w:p>
-    <w:p>
-      <w:pPr>
-        <w:spacing w:before="0" w:after="0" w:line="240" w:lineRule="auto"/>
-      </w:pPr>
-      <w:r>
-        <w:rPr>
-          <w:rFonts w:ascii="Courier New" w:hAnsi="Courier New" w:cs="Courier New" w:eastAsia="Courier New"/>
-          <w:b w:val="0"/>
-          <w:i w:val="0"/>
-          <w:sz w:val="20"/>
-        </w:rPr>
-        <w:t>Operation completed.</w:t>
-      </w:r>
-    </w:p>
-    <w:p>
-      <w:pPr>
-        <w:spacing w:before="0" w:after="0" w:line="240" w:lineRule="auto"/>
-      </w:pPr>
-    </w:p>
-    <w:p>
-      <w:pPr>
-        <w:spacing w:before="0" w:after="0" w:line="480" w:lineRule="auto"/>
-      </w:pPr>
-      <w:r>
-        <w:rPr>
-          <w:rFonts w:ascii="Times New Roman" w:hAnsi="Times New Roman" w:cs="Times New Roman" w:eastAsia="Times New Roman"/>
-          <w:b w:val="0"/>
-          <w:i w:val="0"/>
-          <w:sz w:val="24"/>
-        </w:rPr>
-        <w:t>All three runs end with "Operation completed." The first prints the saved feedback, and the second and third each print only their own error message. Neither error crashed the program.</w:t>
-      </w:r>
-    </w:p>
-    <w:p>
-      <w:pPr>
-        <w:keepNext/>
-        <w:spacing w:before="0" w:after="0" w:line="480" w:lineRule="auto"/>
-      </w:pPr>
-      <w:r>
-        <w:rPr>
-          <w:rFonts w:ascii="Times New Roman" w:hAnsi="Times New Roman" w:cs="Times New Roman" w:eastAsia="Times New Roman"/>
-          <w:b/>
-          <w:i w:val="0"/>
-          <w:sz w:val="24"/>
-        </w:rPr>
-        <w:t>Q4: Counting Mentions of "Great" and Writing a Summary</w:t>
-      </w:r>
-    </w:p>
-    <w:p>
-      <w:pPr>
-        <w:spacing w:before="0" w:after="0" w:line="480" w:lineRule="auto"/>
-      </w:pPr>
-      <w:r>
-        <w:rPr>
-          <w:rFonts w:ascii="Times New Roman" w:hAnsi="Times New Roman" w:cs="Times New Roman" w:eastAsia="Times New Roman"/>
-          <w:b w:val="0"/>
-          <w:i w:val="0"/>
-          <w:sz w:val="24"/>
-        </w:rPr>
-        <w:t xml:space="preserve">The last program reads </w:t>
-      </w:r>
-      <w:r>
-        <w:rPr>
-          <w:rFonts w:ascii="Courier New" w:hAnsi="Courier New" w:cs="Courier New" w:eastAsia="Courier New"/>
-          <w:b w:val="0"/>
-          <w:i w:val="0"/>
-          <w:sz w:val="22"/>
-        </w:rPr>
-        <w:t>feedback.txt</w:t>
-      </w:r>
-      <w:r>
-        <w:rPr>
-          <w:rFonts w:ascii="Times New Roman" w:hAnsi="Times New Roman" w:cs="Times New Roman" w:eastAsia="Times New Roman"/>
-          <w:b w:val="0"/>
-          <w:i w:val="0"/>
-          <w:sz w:val="24"/>
-        </w:rPr>
-        <w:t xml:space="preserve"> with </w:t>
-      </w:r>
-      <w:r>
-        <w:rPr>
-          <w:rFonts w:ascii="Courier New" w:hAnsi="Courier New" w:cs="Courier New" w:eastAsia="Courier New"/>
-          <w:b w:val="0"/>
-          <w:i w:val="0"/>
-          <w:sz w:val="22"/>
-        </w:rPr>
-        <w:t>readlines()</w:t>
-      </w:r>
-      <w:r>
-        <w:rPr>
-          <w:rFonts w:ascii="Times New Roman" w:hAnsi="Times New Roman" w:cs="Times New Roman" w:eastAsia="Times New Roman"/>
-          <w:b w:val="0"/>
-          <w:i w:val="0"/>
-          <w:sz w:val="24"/>
-        </w:rPr>
-        <w:t xml:space="preserve">, one of the file reading methods listed in the File Handling chapter (Mohbey &amp; Acharya, 2023). It then strips each line and skips blank ones, so an empty line at the end of the file can't inflate the total. The check itself is </w:t>
+        <w:t xml:space="preserve">, which returns a list of the file's lines (Mohbey &amp; Acharya, 2023). It then strips each line and skips blank ones, so an empty line at the end of the file can't inflate the total. The check itself is </w:t>
       </w:r>
       <w:r>
         <w:rPr>

</xml_diff>